<commit_message>
Committees + Guide: chair reports for all 8 topics, updated ROP, 2 new guide documents
- apps/web/public/reports/{ecosoc,unoosa}-{1..4}.pdf: chair reports, linked
  from topics.report (Committees page "Download" button)
- seed topics now carry the real titles instead of TBA placeholders
- ROP for delegates replaced with the revised version (adds a notes page)
- new Guide documents: "Points and Motions for Delegates" (after ROP) and
  "Emergency Speech Outlines" (last); later entries re-numbered

Seed + static files only — production rows are updated after deploy.

Co-Authored-By: Claude Fable 5.1 <noreply@anthropic.com>
</commit_message>
<xml_diff>
--- a/apps/web/public/docs/daemun-iii-rop.docx
+++ b/apps/web/public/docs/daemun-iii-rop.docx
@@ -75,6 +75,30 @@
         <w:spacing w:line="276" w:lineRule="auto"/>
         <w:rPr>
           <w:rFonts w:ascii="Times New Roman" w:hAnsi="Times New Roman" w:cs="Times New Roman"/>
+        </w:rPr>
+      </w:pPr>
+      <w:r>
+        <w:rPr>
+          <w:rFonts w:ascii="Times New Roman" w:hAnsi="Times New Roman" w:cs="Times New Roman"/>
+        </w:rPr>
+        <w:t>*This document is comprised of ROP explanation and additional note page at the end</w:t>
+      </w:r>
+    </w:p>
+    <w:p>
+      <w:pPr>
+        <w:pStyle w:val="NoSpacing"/>
+        <w:spacing w:line="276" w:lineRule="auto"/>
+        <w:rPr>
+          <w:rFonts w:ascii="Times New Roman" w:hAnsi="Times New Roman" w:cs="Times New Roman"/>
+        </w:rPr>
+      </w:pPr>
+    </w:p>
+    <w:p>
+      <w:pPr>
+        <w:pStyle w:val="NoSpacing"/>
+        <w:spacing w:line="276" w:lineRule="auto"/>
+        <w:rPr>
+          <w:rFonts w:ascii="Times New Roman" w:hAnsi="Times New Roman" w:cs="Times New Roman"/>
           <w:lang w:val="en-KR"/>
         </w:rPr>
       </w:pPr>
@@ -350,6 +374,27 @@
       <w:pPr>
         <w:pStyle w:val="NoSpacing"/>
         <w:numPr>
+          <w:ilvl w:val="1"/>
+          <w:numId w:val="5"/>
+        </w:numPr>
+        <w:spacing w:line="276" w:lineRule="auto"/>
+        <w:jc w:val="both"/>
+        <w:rPr>
+          <w:rFonts w:ascii="Times New Roman" w:hAnsi="Times New Roman" w:cs="Times New Roman"/>
+          <w:lang w:val="en-KR"/>
+        </w:rPr>
+      </w:pPr>
+      <w:r>
+        <w:rPr>
+          <w:rFonts w:ascii="Times New Roman" w:hAnsi="Times New Roman" w:cs="Times New Roman"/>
+        </w:rPr>
+        <w:t>If needed, please refer to the opening speech template presented on the official DAEMUN III website.</w:t>
+      </w:r>
+    </w:p>
+    <w:p>
+      <w:pPr>
+        <w:pStyle w:val="NoSpacing"/>
+        <w:numPr>
           <w:ilvl w:val="0"/>
           <w:numId w:val="5"/>
         </w:numPr>
@@ -394,7 +439,13 @@
         <w:rPr>
           <w:rFonts w:ascii="Times New Roman" w:hAnsi="Times New Roman" w:cs="Times New Roman"/>
         </w:rPr>
-        <w:t>its opening</w:t>
+        <w:t>the</w:t>
+      </w:r>
+      <w:r>
+        <w:rPr>
+          <w:rFonts w:ascii="Times New Roman" w:hAnsi="Times New Roman" w:cs="Times New Roman"/>
+        </w:rPr>
+        <w:t xml:space="preserve"> opening</w:t>
       </w:r>
       <w:r>
         <w:rPr>
@@ -412,75 +463,60 @@
     <w:p>
       <w:pPr>
         <w:pStyle w:val="NoSpacing"/>
-        <w:spacing w:line="276" w:lineRule="auto"/>
-        <w:jc w:val="both"/>
-        <w:rPr>
-          <w:rFonts w:ascii="Times New Roman" w:hAnsi="Times New Roman" w:cs="Times New Roman"/>
-          <w:lang w:val="en-KR"/>
-        </w:rPr>
-      </w:pPr>
-    </w:p>
-    <w:p>
-      <w:pPr>
-        <w:pStyle w:val="NoSpacing"/>
-        <w:spacing w:line="276" w:lineRule="auto"/>
-        <w:jc w:val="both"/>
-        <w:rPr>
-          <w:rFonts w:ascii="Times New Roman" w:hAnsi="Times New Roman" w:cs="Times New Roman"/>
-          <w:lang w:val="en-KR"/>
-        </w:rPr>
-      </w:pPr>
-      <w:r>
-        <w:rPr>
-          <w:rFonts w:ascii="Times New Roman" w:hAnsi="Times New Roman" w:cs="Times New Roman"/>
-          <w:lang w:val="en-KR"/>
-        </w:rPr>
-        <w:t xml:space="preserve">* Please note that </w:t>
-      </w:r>
-      <w:r>
-        <w:rPr>
-          <w:rFonts w:ascii="Times New Roman" w:hAnsi="Times New Roman" w:cs="Times New Roman"/>
-          <w:lang w:val="en-KR"/>
-        </w:rPr>
-        <w:t xml:space="preserve">in DAEMUN III, </w:t>
-      </w:r>
-      <w:r>
-        <w:rPr>
-          <w:rFonts w:ascii="Times New Roman" w:hAnsi="Times New Roman" w:cs="Times New Roman"/>
-          <w:lang w:val="en-KR"/>
-        </w:rPr>
-        <w:t xml:space="preserve">lobbying and merging sessions and approval of the resolution paper by the Approval Panel must be done before the conference sessions; </w:t>
-      </w:r>
-      <w:r>
-        <w:rPr>
-          <w:rFonts w:ascii="Times New Roman" w:hAnsi="Times New Roman" w:cs="Times New Roman"/>
-          <w:lang w:val="en-KR"/>
-        </w:rPr>
-        <w:t xml:space="preserve">please </w:t>
-      </w:r>
-      <w:r>
-        <w:rPr>
-          <w:rFonts w:ascii="Times New Roman" w:hAnsi="Times New Roman" w:cs="Times New Roman"/>
-          <w:lang w:val="en-KR"/>
-        </w:rPr>
-        <w:t>refer</w:t>
-      </w:r>
-      <w:r>
-        <w:rPr>
-          <w:rFonts w:ascii="Times New Roman" w:hAnsi="Times New Roman" w:cs="Times New Roman"/>
-          <w:lang w:val="en-KR"/>
-        </w:rPr>
-        <w:t xml:space="preserve"> to the DAEMUN III official schedule for detailed information</w:t>
-      </w:r>
-    </w:p>
-    <w:p>
-      <w:pPr>
-        <w:pStyle w:val="NoSpacing"/>
-        <w:spacing w:line="276" w:lineRule="auto"/>
-        <w:jc w:val="both"/>
-        <w:rPr>
-          <w:rFonts w:ascii="Times New Roman" w:hAnsi="Times New Roman" w:cs="Times New Roman"/>
-          <w:lang w:val="en-KR"/>
+        <w:numPr>
+          <w:ilvl w:val="0"/>
+          <w:numId w:val="5"/>
+        </w:numPr>
+        <w:spacing w:line="276" w:lineRule="auto"/>
+        <w:jc w:val="both"/>
+        <w:rPr>
+          <w:rFonts w:ascii="Times New Roman" w:hAnsi="Times New Roman" w:cs="Times New Roman"/>
+          <w:lang w:val="en-KR"/>
+        </w:rPr>
+      </w:pPr>
+      <w:r>
+        <w:rPr>
+          <w:rFonts w:ascii="Times New Roman" w:hAnsi="Times New Roman" w:cs="Times New Roman"/>
+        </w:rPr>
+        <w:t>Once done, delegate may go back to their seat</w:t>
+      </w:r>
+    </w:p>
+    <w:p>
+      <w:pPr>
+        <w:pStyle w:val="NoSpacing"/>
+        <w:spacing w:line="276" w:lineRule="auto"/>
+        <w:jc w:val="both"/>
+        <w:rPr>
+          <w:rFonts w:ascii="Times New Roman" w:hAnsi="Times New Roman" w:cs="Times New Roman"/>
+          <w:lang w:val="en-KR" w:eastAsia="ko-KR"/>
+        </w:rPr>
+      </w:pPr>
+    </w:p>
+    <w:p>
+      <w:pPr>
+        <w:pStyle w:val="NoSpacing"/>
+        <w:spacing w:line="276" w:lineRule="auto"/>
+        <w:rPr>
+          <w:rFonts w:ascii="Times New Roman" w:hAnsi="Times New Roman" w:cs="Times New Roman" w:hint="eastAsia"/>
+          <w:lang w:eastAsia="ko-KR"/>
+        </w:rPr>
+      </w:pPr>
+      <w:r>
+        <w:rPr>
+          <w:rFonts w:ascii="Times New Roman" w:hAnsi="Times New Roman" w:cs="Times New Roman"/>
+          <w:lang w:eastAsia="ko-KR"/>
+        </w:rPr>
+        <w:t xml:space="preserve">Note that lobbying and merging sessions and the Approval Panel are conducted before the conference. Please refer to the official DAEMUN III schedule (available on the DAEMUN III website) for more information. </w:t>
+      </w:r>
+    </w:p>
+    <w:p>
+      <w:pPr>
+        <w:pStyle w:val="NoSpacing"/>
+        <w:spacing w:line="276" w:lineRule="auto"/>
+        <w:jc w:val="both"/>
+        <w:rPr>
+          <w:rFonts w:ascii="Times New Roman" w:hAnsi="Times New Roman" w:cs="Times New Roman" w:hint="eastAsia"/>
+          <w:lang w:val="en-KR" w:eastAsia="ko-KR"/>
         </w:rPr>
       </w:pPr>
     </w:p>
@@ -986,7 +1022,6 @@
           <w:rFonts w:ascii="Times New Roman" w:hAnsi="Times New Roman" w:cs="Times New Roman"/>
           <w:lang w:eastAsia="ko-KR"/>
         </w:rPr>
-        <w:lastRenderedPageBreak/>
         <w:t xml:space="preserve">Once done, the delegate will receive </w:t>
       </w:r>
       <w:r>
@@ -1166,7 +1201,7 @@
         <w:spacing w:line="276" w:lineRule="auto"/>
         <w:jc w:val="both"/>
         <w:rPr>
-          <w:rFonts w:ascii="Times New Roman" w:hAnsi="Times New Roman" w:cs="Times New Roman" w:hint="eastAsia"/>
+          <w:rFonts w:ascii="Times New Roman" w:hAnsi="Times New Roman" w:cs="Times New Roman"/>
           <w:lang w:eastAsia="ko-KR"/>
         </w:rPr>
       </w:pPr>
@@ -2225,7 +2260,6 @@
       <w:pPr>
         <w:pStyle w:val="NoSpacing"/>
         <w:spacing w:line="276" w:lineRule="auto"/>
-        <w:jc w:val="both"/>
         <w:rPr>
           <w:rFonts w:ascii="Times New Roman" w:hAnsi="Times New Roman" w:cs="Times New Roman"/>
         </w:rPr>
@@ -2237,6 +2271,7 @@
           <w:bCs/>
           <w:u w:val="single"/>
         </w:rPr>
+        <w:lastRenderedPageBreak/>
         <w:t xml:space="preserve">Debate (Voting </w:t>
       </w:r>
       <w:r>
@@ -2278,18 +2313,17 @@
           <w:numId w:val="15"/>
         </w:numPr>
         <w:spacing w:line="276" w:lineRule="auto"/>
-        <w:jc w:val="both"/>
-        <w:rPr>
-          <w:rFonts w:ascii="Times New Roman" w:hAnsi="Times New Roman" w:cs="Times New Roman"/>
-          <w:lang w:eastAsia="ko-KR"/>
-        </w:rPr>
-      </w:pPr>
-      <w:r>
-        <w:rPr>
-          <w:rFonts w:ascii="Times New Roman" w:hAnsi="Times New Roman" w:cs="Times New Roman"/>
-          <w:lang w:eastAsia="ko-KR"/>
-        </w:rPr>
-        <w:t>All delegates are required to vote in favor or against regarding the presented amendment.</w:t>
+        <w:rPr>
+          <w:rFonts w:ascii="Times New Roman" w:hAnsi="Times New Roman" w:cs="Times New Roman"/>
+          <w:lang w:eastAsia="ko-KR"/>
+        </w:rPr>
+      </w:pPr>
+      <w:r>
+        <w:rPr>
+          <w:rFonts w:ascii="Times New Roman" w:hAnsi="Times New Roman" w:cs="Times New Roman"/>
+          <w:lang w:eastAsia="ko-KR"/>
+        </w:rPr>
+        <w:t>All delegates are required to vote in favor or against the presented amendment.</w:t>
       </w:r>
     </w:p>
     <w:p>
@@ -2300,18 +2334,45 @@
           <w:numId w:val="14"/>
         </w:numPr>
         <w:spacing w:line="276" w:lineRule="auto"/>
-        <w:jc w:val="both"/>
-        <w:rPr>
-          <w:rFonts w:ascii="Times New Roman" w:hAnsi="Times New Roman" w:cs="Times New Roman"/>
-          <w:lang w:eastAsia="ko-KR"/>
-        </w:rPr>
-      </w:pPr>
-      <w:r>
-        <w:rPr>
-          <w:rFonts w:ascii="Times New Roman" w:hAnsi="Times New Roman" w:cs="Times New Roman"/>
-          <w:lang w:eastAsia="ko-KR"/>
-        </w:rPr>
-        <w:t>Delegates could vote by raising their placards.</w:t>
+        <w:rPr>
+          <w:rFonts w:ascii="Times New Roman" w:hAnsi="Times New Roman" w:cs="Times New Roman"/>
+          <w:lang w:eastAsia="ko-KR"/>
+        </w:rPr>
+      </w:pPr>
+      <w:r>
+        <w:rPr>
+          <w:rFonts w:ascii="Times New Roman" w:hAnsi="Times New Roman" w:cs="Times New Roman"/>
+          <w:lang w:eastAsia="ko-KR"/>
+        </w:rPr>
+        <w:t xml:space="preserve">Delegates </w:t>
+      </w:r>
+      <w:r>
+        <w:rPr>
+          <w:rFonts w:ascii="Times New Roman" w:hAnsi="Times New Roman" w:cs="Times New Roman"/>
+          <w:lang w:eastAsia="ko-KR"/>
+        </w:rPr>
+        <w:t>can</w:t>
+      </w:r>
+      <w:r>
+        <w:rPr>
+          <w:rFonts w:ascii="Times New Roman" w:hAnsi="Times New Roman" w:cs="Times New Roman"/>
+          <w:lang w:eastAsia="ko-KR"/>
+        </w:rPr>
+        <w:t xml:space="preserve"> vote by </w:t>
+      </w:r>
+      <w:r>
+        <w:rPr>
+          <w:rFonts w:ascii="Times New Roman" w:hAnsi="Times New Roman" w:cs="Times New Roman"/>
+          <w:lang w:eastAsia="ko-KR"/>
+        </w:rPr>
+        <w:t xml:space="preserve">simply </w:t>
+      </w:r>
+      <w:r>
+        <w:rPr>
+          <w:rFonts w:ascii="Times New Roman" w:hAnsi="Times New Roman" w:cs="Times New Roman"/>
+          <w:lang w:eastAsia="ko-KR"/>
+        </w:rPr>
+        <w:t>raising their placards.</w:t>
       </w:r>
     </w:p>
     <w:p>
@@ -2322,7 +2383,6 @@
           <w:numId w:val="14"/>
         </w:numPr>
         <w:spacing w:line="276" w:lineRule="auto"/>
-        <w:jc w:val="both"/>
         <w:rPr>
           <w:rFonts w:ascii="Times New Roman" w:hAnsi="Times New Roman" w:cs="Times New Roman"/>
           <w:lang w:eastAsia="ko-KR"/>
@@ -2365,19 +2425,31 @@
           <w:numId w:val="14"/>
         </w:numPr>
         <w:spacing w:line="276" w:lineRule="auto"/>
-        <w:jc w:val="both"/>
-        <w:rPr>
-          <w:rFonts w:ascii="Times New Roman" w:hAnsi="Times New Roman" w:cs="Times New Roman"/>
-          <w:lang w:eastAsia="ko-KR"/>
-        </w:rPr>
-      </w:pPr>
-      <w:r>
-        <w:rPr>
-          <w:rFonts w:ascii="Times New Roman" w:hAnsi="Times New Roman" w:cs="Times New Roman"/>
-          <w:lang w:eastAsia="ko-KR"/>
-        </w:rPr>
-        <w:lastRenderedPageBreak/>
-        <w:t>Once done, the chair will open the floor again.</w:t>
+        <w:rPr>
+          <w:rFonts w:ascii="Times New Roman" w:hAnsi="Times New Roman" w:cs="Times New Roman"/>
+          <w:lang w:eastAsia="ko-KR"/>
+        </w:rPr>
+      </w:pPr>
+      <w:r>
+        <w:rPr>
+          <w:rFonts w:ascii="Times New Roman" w:hAnsi="Times New Roman" w:cs="Times New Roman"/>
+          <w:lang w:eastAsia="ko-KR"/>
+        </w:rPr>
+        <w:t xml:space="preserve">Once done, the chair </w:t>
+      </w:r>
+      <w:r>
+        <w:rPr>
+          <w:rFonts w:ascii="Times New Roman" w:hAnsi="Times New Roman" w:cs="Times New Roman"/>
+          <w:lang w:eastAsia="ko-KR"/>
+        </w:rPr>
+        <w:t xml:space="preserve">will count the vote and </w:t>
+      </w:r>
+      <w:r>
+        <w:rPr>
+          <w:rFonts w:ascii="Times New Roman" w:hAnsi="Times New Roman" w:cs="Times New Roman"/>
+          <w:lang w:eastAsia="ko-KR"/>
+        </w:rPr>
+        <w:t>open the floor again.</w:t>
       </w:r>
     </w:p>
     <w:p>
@@ -2617,7 +2689,6 @@
         <w:jc w:val="both"/>
         <w:rPr>
           <w:rFonts w:ascii="Times New Roman" w:hAnsi="Times New Roman" w:cs="Times New Roman"/>
-          <w:lang w:eastAsia="ko-KR"/>
         </w:rPr>
       </w:pPr>
       <w:r>
@@ -2638,6 +2709,86 @@
         </w:rPr>
         <w:t>.</w:t>
       </w:r>
+    </w:p>
+    <w:p>
+      <w:pPr>
+        <w:pStyle w:val="NoSpacing"/>
+        <w:spacing w:line="276" w:lineRule="auto"/>
+        <w:jc w:val="both"/>
+        <w:rPr>
+          <w:rFonts w:ascii="Times New Roman" w:hAnsi="Times New Roman" w:cs="Times New Roman"/>
+        </w:rPr>
+      </w:pPr>
+    </w:p>
+    <w:p>
+      <w:pPr>
+        <w:pStyle w:val="NoSpacing"/>
+        <w:spacing w:line="276" w:lineRule="auto"/>
+        <w:jc w:val="both"/>
+        <w:rPr>
+          <w:rFonts w:ascii="Times New Roman" w:hAnsi="Times New Roman" w:cs="Times New Roman"/>
+        </w:rPr>
+      </w:pPr>
+    </w:p>
+    <w:p>
+      <w:pPr>
+        <w:pStyle w:val="NoSpacing"/>
+        <w:spacing w:line="276" w:lineRule="auto"/>
+        <w:jc w:val="both"/>
+        <w:rPr>
+          <w:rFonts w:ascii="Times New Roman" w:hAnsi="Times New Roman" w:cs="Times New Roman"/>
+        </w:rPr>
+      </w:pPr>
+    </w:p>
+    <w:p>
+      <w:pPr>
+        <w:pStyle w:val="NoSpacing"/>
+        <w:spacing w:line="276" w:lineRule="auto"/>
+        <w:jc w:val="both"/>
+        <w:rPr>
+          <w:rFonts w:ascii="Times New Roman" w:hAnsi="Times New Roman" w:cs="Times New Roman"/>
+        </w:rPr>
+      </w:pPr>
+    </w:p>
+    <w:p>
+      <w:pPr>
+        <w:pStyle w:val="NoSpacing"/>
+        <w:spacing w:line="276" w:lineRule="auto"/>
+        <w:jc w:val="both"/>
+        <w:rPr>
+          <w:rFonts w:ascii="Times New Roman" w:hAnsi="Times New Roman" w:cs="Times New Roman"/>
+        </w:rPr>
+      </w:pPr>
+    </w:p>
+    <w:p>
+      <w:pPr>
+        <w:pStyle w:val="NoSpacing"/>
+        <w:spacing w:line="276" w:lineRule="auto"/>
+        <w:jc w:val="both"/>
+        <w:rPr>
+          <w:rFonts w:ascii="Times New Roman" w:hAnsi="Times New Roman" w:cs="Times New Roman"/>
+        </w:rPr>
+      </w:pPr>
+    </w:p>
+    <w:p>
+      <w:pPr>
+        <w:pStyle w:val="NoSpacing"/>
+        <w:spacing w:line="276" w:lineRule="auto"/>
+        <w:jc w:val="both"/>
+        <w:rPr>
+          <w:rFonts w:ascii="Times New Roman" w:hAnsi="Times New Roman" w:cs="Times New Roman"/>
+        </w:rPr>
+      </w:pPr>
+    </w:p>
+    <w:p>
+      <w:pPr>
+        <w:pStyle w:val="NoSpacing"/>
+        <w:spacing w:line="276" w:lineRule="auto"/>
+        <w:jc w:val="both"/>
+        <w:rPr>
+          <w:rFonts w:ascii="Times New Roman" w:hAnsi="Times New Roman" w:cs="Times New Roman"/>
+        </w:rPr>
+      </w:pPr>
     </w:p>
     <w:p>
       <w:pPr>
@@ -2782,13 +2933,13 @@
         <w:rPr>
           <w:rFonts w:ascii="Times New Roman" w:hAnsi="Times New Roman" w:cs="Times New Roman"/>
         </w:rPr>
-        <w:t xml:space="preserve">Engage in attendance at all </w:t>
-      </w:r>
-      <w:r>
-        <w:rPr>
-          <w:rFonts w:ascii="Times New Roman" w:hAnsi="Times New Roman" w:cs="Times New Roman"/>
-        </w:rPr>
-        <w:t>two</w:t>
+        <w:t xml:space="preserve">Engage in attendance at </w:t>
+      </w:r>
+      <w:r>
+        <w:rPr>
+          <w:rFonts w:ascii="Times New Roman" w:hAnsi="Times New Roman" w:cs="Times New Roman"/>
+        </w:rPr>
+        <w:t>both</w:t>
       </w:r>
       <w:r>
         <w:rPr>
@@ -2847,37 +2998,6 @@
       <w:pPr>
         <w:pStyle w:val="NoSpacing"/>
         <w:spacing w:line="276" w:lineRule="auto"/>
-        <w:rPr>
-          <w:rFonts w:ascii="Times New Roman" w:hAnsi="Times New Roman" w:cs="Times New Roman"/>
-        </w:rPr>
-      </w:pPr>
-    </w:p>
-    <w:p>
-      <w:pPr>
-        <w:pStyle w:val="NoSpacing"/>
-        <w:spacing w:line="276" w:lineRule="auto"/>
-        <w:jc w:val="both"/>
-        <w:rPr>
-          <w:rFonts w:ascii="Times New Roman" w:hAnsi="Times New Roman" w:cs="Times New Roman"/>
-          <w:b/>
-          <w:bCs/>
-          <w:lang w:val="en-KR"/>
-        </w:rPr>
-      </w:pPr>
-      <w:r>
-        <w:rPr>
-          <w:rFonts w:ascii="Times New Roman" w:hAnsi="Times New Roman" w:cs="Times New Roman"/>
-          <w:b/>
-          <w:bCs/>
-          <w:lang w:val="en-KR"/>
-        </w:rPr>
-        <w:t xml:space="preserve">Notes and Amendments </w:t>
-      </w:r>
-    </w:p>
-    <w:p>
-      <w:pPr>
-        <w:pStyle w:val="NoSpacing"/>
-        <w:spacing w:line="276" w:lineRule="auto"/>
         <w:jc w:val="both"/>
         <w:rPr>
           <w:rFonts w:ascii="Times New Roman" w:hAnsi="Times New Roman" w:cs="Times New Roman"/>
@@ -2895,21 +3015,18 @@
         <w:jc w:val="both"/>
         <w:rPr>
           <w:rFonts w:ascii="Times New Roman" w:hAnsi="Times New Roman" w:cs="Times New Roman"/>
-          <w:lang w:val="en-KR"/>
-        </w:rPr>
-      </w:pPr>
-      <w:r>
-        <w:rPr>
-          <w:rFonts w:ascii="Times New Roman" w:hAnsi="Times New Roman" w:cs="Times New Roman"/>
-          <w:u w:val="single"/>
-        </w:rPr>
-        <w:t>Guidelines for Note Distribution</w:t>
-      </w:r>
-      <w:r>
-        <w:rPr>
-          <w:rFonts w:ascii="Times New Roman" w:hAnsi="Times New Roman" w:cs="Times New Roman"/>
-        </w:rPr>
-        <w:t>:</w:t>
+          <w:b/>
+          <w:bCs/>
+          <w:lang w:val="en-KR"/>
+        </w:rPr>
+      </w:pPr>
+      <w:r>
+        <w:rPr>
+          <w:rFonts w:ascii="Times New Roman" w:hAnsi="Times New Roman" w:cs="Times New Roman"/>
+          <w:b/>
+          <w:bCs/>
+        </w:rPr>
+        <w:t>Guidelines for Note:</w:t>
       </w:r>
     </w:p>
     <w:p>
@@ -2930,13 +3047,25 @@
         <w:rPr>
           <w:rFonts w:ascii="Times New Roman" w:hAnsi="Times New Roman" w:cs="Times New Roman"/>
         </w:rPr>
-        <w:t>Delegates and chairs are permitted to submit their notes through the admins</w:t>
-      </w:r>
-      <w:r>
-        <w:rPr>
-          <w:rFonts w:ascii="Times New Roman" w:hAnsi="Times New Roman" w:cs="Times New Roman"/>
-        </w:rPr>
-        <w:t xml:space="preserve"> in the conference room</w:t>
+        <w:t xml:space="preserve">Delegates may request additional note sheets </w:t>
+      </w:r>
+      <w:r>
+        <w:rPr>
+          <w:rFonts w:ascii="Times New Roman" w:hAnsi="Times New Roman" w:cs="Times New Roman"/>
+        </w:rPr>
+        <w:t>from</w:t>
+      </w:r>
+      <w:r>
+        <w:rPr>
+          <w:rFonts w:ascii="Times New Roman" w:hAnsi="Times New Roman" w:cs="Times New Roman"/>
+        </w:rPr>
+        <w:t xml:space="preserve"> the adm</w:t>
+      </w:r>
+      <w:r>
+        <w:rPr>
+          <w:rFonts w:ascii="Times New Roman" w:hAnsi="Times New Roman" w:cs="Times New Roman"/>
+        </w:rPr>
+        <w:t>ins</w:t>
       </w:r>
     </w:p>
     <w:p>
@@ -3026,35 +3155,55 @@
         <w:rPr>
           <w:rFonts w:ascii="Times New Roman" w:hAnsi="Times New Roman" w:cs="Times New Roman"/>
         </w:rPr>
-        <w:t>If a note is deemed inappropriate, the admins will inform the person who wrote it before withholding the distribution of the note</w:t>
-      </w:r>
-    </w:p>
-    <w:p>
-      <w:pPr>
-        <w:pStyle w:val="NoSpacing"/>
-        <w:spacing w:line="276" w:lineRule="auto"/>
-        <w:jc w:val="both"/>
-        <w:rPr>
-          <w:rFonts w:ascii="Times New Roman" w:hAnsi="Times New Roman" w:cs="Times New Roman"/>
-          <w:lang w:val="en-KR"/>
-        </w:rPr>
-      </w:pPr>
-    </w:p>
-    <w:p>
-      <w:pPr>
-        <w:pStyle w:val="NoSpacing"/>
-        <w:spacing w:line="276" w:lineRule="auto"/>
-        <w:jc w:val="both"/>
-        <w:rPr>
-          <w:rFonts w:ascii="Times New Roman" w:hAnsi="Times New Roman" w:cs="Times New Roman"/>
-          <w:u w:val="single"/>
-          <w:lang w:val="en-KR"/>
-        </w:rPr>
-      </w:pPr>
-      <w:r>
-        <w:rPr>
-          <w:rFonts w:ascii="Times New Roman" w:hAnsi="Times New Roman" w:cs="Times New Roman"/>
-          <w:u w:val="single"/>
+        <w:t xml:space="preserve">If a note is deemed inappropriate, the admins will inform </w:t>
+      </w:r>
+      <w:r>
+        <w:rPr>
+          <w:rFonts w:ascii="Times New Roman" w:hAnsi="Times New Roman" w:cs="Times New Roman"/>
+        </w:rPr>
+        <w:t xml:space="preserve">the delegate </w:t>
+      </w:r>
+      <w:r>
+        <w:rPr>
+          <w:rFonts w:ascii="Times New Roman" w:hAnsi="Times New Roman" w:cs="Times New Roman"/>
+        </w:rPr>
+        <w:t>before withholding the distribution of the note</w:t>
+      </w:r>
+      <w:r>
+        <w:rPr>
+          <w:rFonts w:ascii="Times New Roman" w:hAnsi="Times New Roman" w:cs="Times New Roman"/>
+        </w:rPr>
+        <w:t>; when considered necessary, admins will report to the Secretaries General.</w:t>
+      </w:r>
+    </w:p>
+    <w:p>
+      <w:pPr>
+        <w:pStyle w:val="NoSpacing"/>
+        <w:spacing w:line="276" w:lineRule="auto"/>
+        <w:jc w:val="both"/>
+        <w:rPr>
+          <w:rFonts w:ascii="Times New Roman" w:hAnsi="Times New Roman" w:cs="Times New Roman"/>
+          <w:lang w:val="en-KR"/>
+        </w:rPr>
+      </w:pPr>
+    </w:p>
+    <w:p>
+      <w:pPr>
+        <w:pStyle w:val="NoSpacing"/>
+        <w:spacing w:line="276" w:lineRule="auto"/>
+        <w:jc w:val="both"/>
+        <w:rPr>
+          <w:rFonts w:ascii="Times New Roman" w:hAnsi="Times New Roman" w:cs="Times New Roman"/>
+          <w:b/>
+          <w:bCs/>
+          <w:lang w:val="en-KR"/>
+        </w:rPr>
+      </w:pPr>
+      <w:r>
+        <w:rPr>
+          <w:rFonts w:ascii="Times New Roman" w:hAnsi="Times New Roman" w:cs="Times New Roman"/>
+          <w:b/>
+          <w:bCs/>
         </w:rPr>
         <w:t>Guidelines for Amendment:</w:t>
       </w:r>
@@ -3077,19 +3226,49 @@
         <w:rPr>
           <w:rFonts w:ascii="Times New Roman" w:hAnsi="Times New Roman" w:cs="Times New Roman"/>
         </w:rPr>
-        <w:t xml:space="preserve">Each delegate may request </w:t>
-      </w:r>
-      <w:r>
-        <w:rPr>
-          <w:rFonts w:ascii="Times New Roman" w:hAnsi="Times New Roman" w:cs="Times New Roman"/>
-        </w:rPr>
-        <w:t xml:space="preserve">an additional </w:t>
-      </w:r>
-      <w:r>
-        <w:rPr>
-          <w:rFonts w:ascii="Times New Roman" w:hAnsi="Times New Roman" w:cs="Times New Roman"/>
-        </w:rPr>
-        <w:t>amendment sheet from the admins</w:t>
+        <w:t>D</w:t>
+      </w:r>
+      <w:r>
+        <w:rPr>
+          <w:rFonts w:ascii="Times New Roman" w:hAnsi="Times New Roman" w:cs="Times New Roman"/>
+        </w:rPr>
+        <w:t>elegate</w:t>
+      </w:r>
+      <w:r>
+        <w:rPr>
+          <w:rFonts w:ascii="Times New Roman" w:hAnsi="Times New Roman" w:cs="Times New Roman"/>
+        </w:rPr>
+        <w:t>s</w:t>
+      </w:r>
+      <w:r>
+        <w:rPr>
+          <w:rFonts w:ascii="Times New Roman" w:hAnsi="Times New Roman" w:cs="Times New Roman"/>
+        </w:rPr>
+        <w:t xml:space="preserve"> may request </w:t>
+      </w:r>
+      <w:r>
+        <w:rPr>
+          <w:rFonts w:ascii="Times New Roman" w:hAnsi="Times New Roman" w:cs="Times New Roman"/>
+        </w:rPr>
+        <w:t xml:space="preserve">additional </w:t>
+      </w:r>
+      <w:r>
+        <w:rPr>
+          <w:rFonts w:ascii="Times New Roman" w:hAnsi="Times New Roman" w:cs="Times New Roman"/>
+        </w:rPr>
+        <w:t>amendment sheet</w:t>
+      </w:r>
+      <w:r>
+        <w:rPr>
+          <w:rFonts w:ascii="Times New Roman" w:hAnsi="Times New Roman" w:cs="Times New Roman"/>
+        </w:rPr>
+        <w:t>s</w:t>
+      </w:r>
+      <w:r>
+        <w:rPr>
+          <w:rFonts w:ascii="Times New Roman" w:hAnsi="Times New Roman" w:cs="Times New Roman"/>
+        </w:rPr>
+        <w:t xml:space="preserve"> from the admins</w:t>
       </w:r>
     </w:p>
     <w:p>
@@ -3116,6 +3295,27 @@
     <w:p>
       <w:pPr>
         <w:pStyle w:val="NoSpacing"/>
+        <w:numPr>
+          <w:ilvl w:val="0"/>
+          <w:numId w:val="6"/>
+        </w:numPr>
+        <w:spacing w:line="276" w:lineRule="auto"/>
+        <w:jc w:val="both"/>
+        <w:rPr>
+          <w:rFonts w:ascii="Times New Roman" w:hAnsi="Times New Roman" w:cs="Times New Roman"/>
+          <w:lang w:val="en-KR"/>
+        </w:rPr>
+      </w:pPr>
+      <w:r>
+        <w:rPr>
+          <w:rFonts w:ascii="Times New Roman" w:hAnsi="Times New Roman" w:cs="Times New Roman"/>
+        </w:rPr>
+        <w:t>Once approved, the chair will notify the delegate through the admin</w:t>
+      </w:r>
+    </w:p>
+    <w:p>
+      <w:pPr>
+        <w:pStyle w:val="NoSpacing"/>
         <w:spacing w:line="276" w:lineRule="auto"/>
         <w:rPr>
           <w:rFonts w:ascii="Times New Roman" w:hAnsi="Times New Roman" w:cs="Times New Roman"/>
@@ -3190,7 +3390,21 @@
           <w:rFonts w:ascii="Times New Roman" w:hAnsi="Times New Roman" w:cs="Times New Roman"/>
           <w:lang w:val="en-KR"/>
         </w:rPr>
-        <w:t>internet or any during the conference session</w:t>
+        <w:t xml:space="preserve">internet or any </w:t>
+      </w:r>
+      <w:r>
+        <w:rPr>
+          <w:rFonts w:ascii="Times New Roman" w:hAnsi="Times New Roman" w:cs="Times New Roman"/>
+          <w:lang w:val="en-KR"/>
+        </w:rPr>
+        <w:t xml:space="preserve">websites </w:t>
+      </w:r>
+      <w:r>
+        <w:rPr>
+          <w:rFonts w:ascii="Times New Roman" w:hAnsi="Times New Roman" w:cs="Times New Roman"/>
+          <w:lang w:val="en-KR"/>
+        </w:rPr>
+        <w:t>during the conference session</w:t>
       </w:r>
       <w:r>
         <w:rPr>
@@ -3204,7 +3418,35 @@
           <w:rFonts w:ascii="Times New Roman" w:hAnsi="Times New Roman" w:cs="Times New Roman"/>
           <w:lang w:val="en-KR"/>
         </w:rPr>
-        <w:t xml:space="preserve"> note that the admins will be checking where the delegates have turned off one’s wifi before the de</w:t>
+        <w:t xml:space="preserve"> note that the admins will be checking </w:t>
+      </w:r>
+      <w:r>
+        <w:rPr>
+          <w:rFonts w:ascii="Times New Roman" w:hAnsi="Times New Roman" w:cs="Times New Roman"/>
+          <w:lang w:val="en-KR"/>
+        </w:rPr>
+        <w:t>whether</w:t>
+      </w:r>
+      <w:r>
+        <w:rPr>
+          <w:rFonts w:ascii="Times New Roman" w:hAnsi="Times New Roman" w:cs="Times New Roman"/>
+          <w:lang w:val="en-KR"/>
+        </w:rPr>
+        <w:t xml:space="preserve"> the delegates have turned off </w:t>
+      </w:r>
+      <w:r>
+        <w:rPr>
+          <w:rFonts w:ascii="Times New Roman" w:hAnsi="Times New Roman" w:cs="Times New Roman"/>
+          <w:lang w:val="en-KR"/>
+        </w:rPr>
+        <w:t>their</w:t>
+      </w:r>
+      <w:r>
+        <w:rPr>
+          <w:rFonts w:ascii="Times New Roman" w:hAnsi="Times New Roman" w:cs="Times New Roman"/>
+          <w:lang w:val="en-KR"/>
+        </w:rPr>
+        <w:t xml:space="preserve"> wifi before the de</w:t>
       </w:r>
       <w:r>
         <w:rPr>
@@ -3239,7 +3481,28 @@
           <w:rFonts w:ascii="Times New Roman" w:hAnsi="Times New Roman" w:cs="Times New Roman"/>
           <w:lang w:val="en-KR"/>
         </w:rPr>
-        <w:t>The secretariat will be checking for AI usage</w:t>
+        <w:t>The secretariat</w:t>
+      </w:r>
+      <w:r>
+        <w:rPr>
+          <w:rFonts w:ascii="Times New Roman" w:hAnsi="Times New Roman" w:cs="Times New Roman"/>
+          <w:lang w:val="en-KR"/>
+        </w:rPr>
+        <w:t xml:space="preserve">s </w:t>
+      </w:r>
+      <w:r>
+        <w:rPr>
+          <w:rFonts w:ascii="Times New Roman" w:hAnsi="Times New Roman" w:cs="Times New Roman"/>
+          <w:lang w:val="en-KR"/>
+        </w:rPr>
+        <w:t>will be checking for AI usage</w:t>
+      </w:r>
+      <w:r>
+        <w:rPr>
+          <w:rFonts w:ascii="Times New Roman" w:hAnsi="Times New Roman" w:cs="Times New Roman"/>
+          <w:lang w:val="en-KR"/>
+        </w:rPr>
+        <w:t>; if detected, the delegates will be reported to the Secretaries-General</w:t>
       </w:r>
     </w:p>
     <w:p>
@@ -3291,49 +3554,73 @@
           <w:rFonts w:ascii="Times New Roman" w:hAnsi="Times New Roman" w:cs="Times New Roman"/>
           <w:lang w:val="en-KR"/>
         </w:rPr>
-        <w:t>All delegates are required to wear official school uniform during the entire conference</w:t>
-      </w:r>
-    </w:p>
-    <w:p>
-      <w:pPr>
-        <w:pStyle w:val="NoSpacing"/>
-        <w:spacing w:line="276" w:lineRule="auto"/>
-        <w:rPr>
-          <w:rFonts w:ascii="Times New Roman" w:hAnsi="Times New Roman" w:cs="Times New Roman"/>
-          <w:lang w:val="en-KR"/>
-        </w:rPr>
-      </w:pPr>
-    </w:p>
-    <w:p>
-      <w:pPr>
-        <w:pStyle w:val="NoSpacing"/>
-        <w:spacing w:line="276" w:lineRule="auto"/>
-        <w:rPr>
-          <w:rFonts w:ascii="Times New Roman" w:hAnsi="Times New Roman" w:cs="Times New Roman"/>
-          <w:b/>
-          <w:bCs/>
-          <w:lang w:val="en-KR"/>
-        </w:rPr>
-      </w:pPr>
-      <w:r>
-        <w:rPr>
-          <w:rFonts w:ascii="Times New Roman" w:hAnsi="Times New Roman" w:cs="Times New Roman"/>
-          <w:b/>
-          <w:bCs/>
-          <w:lang w:val="en-KR"/>
-        </w:rPr>
-        <w:t>Verbal and Written Warning</w:t>
-      </w:r>
-    </w:p>
-    <w:p>
-      <w:pPr>
-        <w:pStyle w:val="NoSpacing"/>
-        <w:spacing w:line="276" w:lineRule="auto"/>
-        <w:rPr>
-          <w:rFonts w:ascii="Times New Roman" w:hAnsi="Times New Roman" w:cs="Times New Roman"/>
-          <w:lang w:val="en-KR"/>
-        </w:rPr>
-      </w:pPr>
+        <w:t xml:space="preserve">All delegates are required to wear official school uniform </w:t>
+      </w:r>
+      <w:r>
+        <w:rPr>
+          <w:rFonts w:ascii="Times New Roman" w:hAnsi="Times New Roman" w:cs="Times New Roman"/>
+          <w:lang w:val="en-KR"/>
+        </w:rPr>
+        <w:t xml:space="preserve">or formal clothing </w:t>
+      </w:r>
+      <w:r>
+        <w:rPr>
+          <w:rFonts w:ascii="Times New Roman" w:hAnsi="Times New Roman" w:cs="Times New Roman"/>
+          <w:lang w:val="en-KR"/>
+        </w:rPr>
+        <w:t>during the entire conference</w:t>
+      </w:r>
+      <w:r>
+        <w:rPr>
+          <w:rFonts w:ascii="Times New Roman" w:hAnsi="Times New Roman" w:cs="Times New Roman"/>
+          <w:lang w:val="en-KR"/>
+        </w:rPr>
+        <w:t xml:space="preserve"> schedule</w:t>
+      </w:r>
+    </w:p>
+    <w:p>
+      <w:pPr>
+        <w:pStyle w:val="NoSpacing"/>
+        <w:spacing w:line="276" w:lineRule="auto"/>
+        <w:rPr>
+          <w:rFonts w:ascii="Times New Roman" w:hAnsi="Times New Roman" w:cs="Times New Roman"/>
+          <w:lang w:val="en-KR"/>
+        </w:rPr>
+      </w:pPr>
+    </w:p>
+    <w:p>
+      <w:pPr>
+        <w:pStyle w:val="NoSpacing"/>
+        <w:spacing w:line="276" w:lineRule="auto"/>
+        <w:rPr>
+          <w:rFonts w:ascii="Times New Roman" w:hAnsi="Times New Roman" w:cs="Times New Roman"/>
+          <w:lang w:val="en-KR"/>
+        </w:rPr>
+      </w:pPr>
+      <w:r>
+        <w:rPr>
+          <w:rFonts w:ascii="Times New Roman" w:hAnsi="Times New Roman" w:cs="Times New Roman"/>
+          <w:lang w:val="en-KR"/>
+        </w:rPr>
+        <w:t>*All chairs and admins reserve the right to report to the Secretaries-General for any inappropriate behaviors during or between conference sessions</w:t>
+      </w:r>
+    </w:p>
+    <w:p>
+      <w:pPr>
+        <w:pStyle w:val="NoSpacing"/>
+        <w:spacing w:line="276" w:lineRule="auto"/>
+        <w:rPr>
+          <w:rFonts w:ascii="Times New Roman" w:hAnsi="Times New Roman" w:cs="Times New Roman"/>
+          <w:lang w:val="en-KR"/>
+        </w:rPr>
+      </w:pPr>
+      <w:r>
+        <w:rPr>
+          <w:rFonts w:ascii="Times New Roman" w:hAnsi="Times New Roman" w:cs="Times New Roman"/>
+          <w:lang w:val="en-KR"/>
+        </w:rPr>
+        <w:t>*If any concerns, questions or doubts should be clarified with the secretariat, please contact the Secretary General (Suhyeon Lee) or the Deputy Secretary General (Boyun Choi)</w:t>
+      </w:r>
     </w:p>
     <w:p>
       <w:pPr>
@@ -3351,6 +3638,7 @@
           <w:rFonts w:ascii="Batang" w:hAnsi="Batang" w:cs="Times New Roman"/>
           <w:sz w:val="20"/>
           <w:szCs w:val="20"/>
+          <w:lang w:val="en-KR"/>
         </w:rPr>
       </w:pPr>
     </w:p>
@@ -3439,7 +3727,7 @@
       <w:rPr>
         <w:noProof/>
       </w:rPr>
-      <w:pict w14:anchorId="1360EDEB">
+      <w:pict w14:anchorId="4D5114A6">
         <v:shapetype id="_x0000_t75" coordsize="21600,21600" o:spt="75" o:preferrelative="t" path="m@4@5l@4@11@9@11@9@5xe" filled="f" stroked="f">
           <v:stroke joinstyle="miter"/>
           <v:formulas>
@@ -3509,7 +3797,7 @@
         <w:rFonts w:ascii="Times New Roman" w:hAnsi="Times New Roman" w:cs="Times New Roman"/>
         <w:noProof/>
       </w:rPr>
-      <w:pict w14:anchorId="7E54707B">
+      <w:pict w14:anchorId="3800CA8D">
         <v:shapetype id="_x0000_t75" coordsize="21600,21600" o:spt="75" o:preferrelative="t" path="m@4@5l@4@11@9@11@9@5xe" filled="f" stroked="f">
           <v:stroke joinstyle="miter"/>
           <v:formulas>
@@ -3549,7 +3837,7 @@
       <w:rPr>
         <w:noProof/>
       </w:rPr>
-      <w:pict w14:anchorId="47FB7AD3">
+      <w:pict w14:anchorId="5378AD13">
         <v:shapetype id="_x0000_t75" coordsize="21600,21600" o:spt="75" o:preferrelative="t" path="m@4@5l@4@11@9@11@9@5xe" filled="f" stroked="f">
           <v:stroke joinstyle="miter"/>
           <v:formulas>
@@ -3582,6 +3870,119 @@
 <file path=word/numbering.xml><?xml version="1.0" encoding="utf-8"?>
 <w:numbering xmlns:wpc="http://schemas.microsoft.com/office/word/2010/wordprocessingCanvas" xmlns:cx="http://schemas.microsoft.com/office/drawing/2014/chartex" xmlns:cx1="http://schemas.microsoft.com/office/drawing/2015/9/8/chartex" xmlns:cx2="http://schemas.microsoft.com/office/drawing/2015/10/21/chartex" xmlns:cx3="http://schemas.microsoft.com/office/drawing/2016/5/9/chartex" xmlns:cx4="http://schemas.microsoft.com/office/drawing/2016/5/10/chartex" xmlns:cx5="http://schemas.microsoft.com/office/drawing/2016/5/11/chartex" xmlns:cx6="http://schemas.microsoft.com/office/drawing/2016/5/12/chartex" xmlns:cx7="http://schemas.microsoft.com/office/drawing/2016/5/13/chartex" xmlns:cx8="http://schemas.microsoft.com/office/drawing/2016/5/14/chartex" xmlns:mc="http://schemas.openxmlformats.org/markup-compatibility/2006" xmlns:m="http://schemas.openxmlformats.org/officeDocument/2006/math" xmlns:aink="http://schemas.microsoft.com/office/drawing/2016/ink" xmlns:am3d="http://schemas.microsoft.com/office/drawing/2017/model3d" xmlns:oel="http://schemas.microsoft.com/office/2019/extlst" xmlns:r="http://schemas.openxmlformats.org/officeDocument/2006/relationships" xmlns:wp14="http://schemas.microsoft.com/office/word/2010/wordprocessingDrawing" xmlns:wp="http://schemas.openxmlformats.org/drawingml/2006/wordprocessingDrawing" xmlns:wpg="http://schemas.microsoft.com/office/word/2010/wordprocessingGroup" xmlns:wpi="http://schemas.microsoft.com/office/word/2010/wordprocessingInk" xmlns:wps="http://schemas.microsoft.com/office/word/2010/wordprocessingShape" xmlns:o="urn:schemas-microsoft-com:office:office" xmlns:v="urn:schemas-microsoft-com:vml" xmlns:w10="urn:schemas-microsoft-com:office:word" xmlns:w="http://schemas.openxmlformats.org/wordprocessingml/2006/main" xmlns:w14="http://schemas.microsoft.com/office/word/2010/wordml" xmlns:w15="http://schemas.microsoft.com/office/word/2012/wordml" xmlns:w16cex="http://schemas.microsoft.com/office/word/2018/wordml/cex" xmlns:w16cid="http://schemas.microsoft.com/office/word/2016/wordml/cid" xmlns:w16="http://schemas.microsoft.com/office/word/2018/wordml" xmlns:w16sdtdh="http://schemas.microsoft.com/office/word/2020/wordml/sdtdatahash" xmlns:w16sdtfl="http://schemas.microsoft.com/office/word/2024/wordml/sdtformatlock" xmlns:w16se="http://schemas.microsoft.com/office/word/2015/wordml/symex" xmlns:w16du="http://schemas.microsoft.com/office/word/2023/wordml/word16du" xmlns:wne="http://schemas.microsoft.com/office/word/2006/wordml" mc:Ignorable="w14 w15 w16se w16cid w16 w16cex w16sdtdh w16sdtfl w16du wp14">
   <w:abstractNum w:abstractNumId="0" w15:restartNumberingAfterBreak="0">
+    <w:nsid w:val="08F67445"/>
+    <w:multiLevelType w:val="hybridMultilevel"/>
+    <w:tmpl w:val="B75CEBAA"/>
+    <w:lvl w:ilvl="0" w:tplc="04090001">
+      <w:start w:val="1"/>
+      <w:numFmt w:val="bullet"/>
+      <w:lvlText w:val=""/>
+      <w:lvlJc w:val="left"/>
+      <w:pPr>
+        <w:ind w:left="720" w:hanging="360"/>
+      </w:pPr>
+      <w:rPr>
+        <w:rFonts w:ascii="Symbol" w:hAnsi="Symbol" w:hint="default"/>
+      </w:rPr>
+    </w:lvl>
+    <w:lvl w:ilvl="1" w:tplc="04090003" w:tentative="1">
+      <w:start w:val="1"/>
+      <w:numFmt w:val="bullet"/>
+      <w:lvlText w:val="o"/>
+      <w:lvlJc w:val="left"/>
+      <w:pPr>
+        <w:ind w:left="1440" w:hanging="360"/>
+      </w:pPr>
+      <w:rPr>
+        <w:rFonts w:ascii="Courier New" w:hAnsi="Courier New" w:hint="default"/>
+      </w:rPr>
+    </w:lvl>
+    <w:lvl w:ilvl="2" w:tplc="04090005" w:tentative="1">
+      <w:start w:val="1"/>
+      <w:numFmt w:val="bullet"/>
+      <w:lvlText w:val=""/>
+      <w:lvlJc w:val="left"/>
+      <w:pPr>
+        <w:ind w:left="2160" w:hanging="360"/>
+      </w:pPr>
+      <w:rPr>
+        <w:rFonts w:ascii="Wingdings" w:hAnsi="Wingdings" w:hint="default"/>
+      </w:rPr>
+    </w:lvl>
+    <w:lvl w:ilvl="3" w:tplc="04090001" w:tentative="1">
+      <w:start w:val="1"/>
+      <w:numFmt w:val="bullet"/>
+      <w:lvlText w:val=""/>
+      <w:lvlJc w:val="left"/>
+      <w:pPr>
+        <w:ind w:left="2880" w:hanging="360"/>
+      </w:pPr>
+      <w:rPr>
+        <w:rFonts w:ascii="Symbol" w:hAnsi="Symbol" w:hint="default"/>
+      </w:rPr>
+    </w:lvl>
+    <w:lvl w:ilvl="4" w:tplc="04090003" w:tentative="1">
+      <w:start w:val="1"/>
+      <w:numFmt w:val="bullet"/>
+      <w:lvlText w:val="o"/>
+      <w:lvlJc w:val="left"/>
+      <w:pPr>
+        <w:ind w:left="3600" w:hanging="360"/>
+      </w:pPr>
+      <w:rPr>
+        <w:rFonts w:ascii="Courier New" w:hAnsi="Courier New" w:hint="default"/>
+      </w:rPr>
+    </w:lvl>
+    <w:lvl w:ilvl="5" w:tplc="04090005" w:tentative="1">
+      <w:start w:val="1"/>
+      <w:numFmt w:val="bullet"/>
+      <w:lvlText w:val=""/>
+      <w:lvlJc w:val="left"/>
+      <w:pPr>
+        <w:ind w:left="4320" w:hanging="360"/>
+      </w:pPr>
+      <w:rPr>
+        <w:rFonts w:ascii="Wingdings" w:hAnsi="Wingdings" w:hint="default"/>
+      </w:rPr>
+    </w:lvl>
+    <w:lvl w:ilvl="6" w:tplc="04090001" w:tentative="1">
+      <w:start w:val="1"/>
+      <w:numFmt w:val="bullet"/>
+      <w:lvlText w:val=""/>
+      <w:lvlJc w:val="left"/>
+      <w:pPr>
+        <w:ind w:left="5040" w:hanging="360"/>
+      </w:pPr>
+      <w:rPr>
+        <w:rFonts w:ascii="Symbol" w:hAnsi="Symbol" w:hint="default"/>
+      </w:rPr>
+    </w:lvl>
+    <w:lvl w:ilvl="7" w:tplc="04090003" w:tentative="1">
+      <w:start w:val="1"/>
+      <w:numFmt w:val="bullet"/>
+      <w:lvlText w:val="o"/>
+      <w:lvlJc w:val="left"/>
+      <w:pPr>
+        <w:ind w:left="5760" w:hanging="360"/>
+      </w:pPr>
+      <w:rPr>
+        <w:rFonts w:ascii="Courier New" w:hAnsi="Courier New" w:hint="default"/>
+      </w:rPr>
+    </w:lvl>
+    <w:lvl w:ilvl="8" w:tplc="04090005" w:tentative="1">
+      <w:start w:val="1"/>
+      <w:numFmt w:val="bullet"/>
+      <w:lvlText w:val=""/>
+      <w:lvlJc w:val="left"/>
+      <w:pPr>
+        <w:ind w:left="6480" w:hanging="360"/>
+      </w:pPr>
+      <w:rPr>
+        <w:rFonts w:ascii="Wingdings" w:hAnsi="Wingdings" w:hint="default"/>
+      </w:rPr>
+    </w:lvl>
+  </w:abstractNum>
+  <w:abstractNum w:abstractNumId="1" w15:restartNumberingAfterBreak="0">
     <w:nsid w:val="09176E2B"/>
     <w:multiLevelType w:val="hybridMultilevel"/>
     <w:tmpl w:val="87D684FC"/>
@@ -3694,7 +4095,7 @@
       </w:rPr>
     </w:lvl>
   </w:abstractNum>
-  <w:abstractNum w:abstractNumId="1" w15:restartNumberingAfterBreak="0">
+  <w:abstractNum w:abstractNumId="2" w15:restartNumberingAfterBreak="0">
     <w:nsid w:val="17C35AE5"/>
     <w:multiLevelType w:val="hybridMultilevel"/>
     <w:tmpl w:val="98629728"/>
@@ -3807,7 +4208,7 @@
       </w:rPr>
     </w:lvl>
   </w:abstractNum>
-  <w:abstractNum w:abstractNumId="2" w15:restartNumberingAfterBreak="0">
+  <w:abstractNum w:abstractNumId="3" w15:restartNumberingAfterBreak="0">
     <w:nsid w:val="274A0DD2"/>
     <w:multiLevelType w:val="hybridMultilevel"/>
     <w:tmpl w:val="AFACFA26"/>
@@ -3920,7 +4321,7 @@
       </w:rPr>
     </w:lvl>
   </w:abstractNum>
-  <w:abstractNum w:abstractNumId="3" w15:restartNumberingAfterBreak="0">
+  <w:abstractNum w:abstractNumId="4" w15:restartNumberingAfterBreak="0">
     <w:nsid w:val="3C49762B"/>
     <w:multiLevelType w:val="hybridMultilevel"/>
     <w:tmpl w:val="2E96973A"/>
@@ -4033,7 +4434,7 @@
       </w:rPr>
     </w:lvl>
   </w:abstractNum>
-  <w:abstractNum w:abstractNumId="4" w15:restartNumberingAfterBreak="0">
+  <w:abstractNum w:abstractNumId="5" w15:restartNumberingAfterBreak="0">
     <w:nsid w:val="3E5164D6"/>
     <w:multiLevelType w:val="hybridMultilevel"/>
     <w:tmpl w:val="4E76606C"/>
@@ -4146,7 +4547,7 @@
       </w:rPr>
     </w:lvl>
   </w:abstractNum>
-  <w:abstractNum w:abstractNumId="5" w15:restartNumberingAfterBreak="0">
+  <w:abstractNum w:abstractNumId="6" w15:restartNumberingAfterBreak="0">
     <w:nsid w:val="434F7273"/>
     <w:multiLevelType w:val="hybridMultilevel"/>
     <w:tmpl w:val="1706C45E"/>
@@ -4259,7 +4660,7 @@
       </w:rPr>
     </w:lvl>
   </w:abstractNum>
-  <w:abstractNum w:abstractNumId="6" w15:restartNumberingAfterBreak="0">
+  <w:abstractNum w:abstractNumId="7" w15:restartNumberingAfterBreak="0">
     <w:nsid w:val="52357196"/>
     <w:multiLevelType w:val="hybridMultilevel"/>
     <w:tmpl w:val="E1C02C64"/>
@@ -4372,7 +4773,7 @@
       </w:rPr>
     </w:lvl>
   </w:abstractNum>
-  <w:abstractNum w:abstractNumId="7" w15:restartNumberingAfterBreak="0">
+  <w:abstractNum w:abstractNumId="8" w15:restartNumberingAfterBreak="0">
     <w:nsid w:val="5A151C73"/>
     <w:multiLevelType w:val="hybridMultilevel"/>
     <w:tmpl w:val="5B04FB4C"/>
@@ -4485,7 +4886,7 @@
       </w:rPr>
     </w:lvl>
   </w:abstractNum>
-  <w:abstractNum w:abstractNumId="8" w15:restartNumberingAfterBreak="0">
+  <w:abstractNum w:abstractNumId="9" w15:restartNumberingAfterBreak="0">
     <w:nsid w:val="5A596107"/>
     <w:multiLevelType w:val="hybridMultilevel"/>
     <w:tmpl w:val="27E6F944"/>
@@ -4598,7 +4999,7 @@
       </w:rPr>
     </w:lvl>
   </w:abstractNum>
-  <w:abstractNum w:abstractNumId="9" w15:restartNumberingAfterBreak="0">
+  <w:abstractNum w:abstractNumId="10" w15:restartNumberingAfterBreak="0">
     <w:nsid w:val="5AB76282"/>
     <w:multiLevelType w:val="hybridMultilevel"/>
     <w:tmpl w:val="C20264C0"/>
@@ -4711,7 +5112,7 @@
       </w:rPr>
     </w:lvl>
   </w:abstractNum>
-  <w:abstractNum w:abstractNumId="10" w15:restartNumberingAfterBreak="0">
+  <w:abstractNum w:abstractNumId="11" w15:restartNumberingAfterBreak="0">
     <w:nsid w:val="621471E2"/>
     <w:multiLevelType w:val="hybridMultilevel"/>
     <w:tmpl w:val="6CB26DF4"/>
@@ -4824,7 +5225,7 @@
       </w:rPr>
     </w:lvl>
   </w:abstractNum>
-  <w:abstractNum w:abstractNumId="11" w15:restartNumberingAfterBreak="0">
+  <w:abstractNum w:abstractNumId="12" w15:restartNumberingAfterBreak="0">
     <w:nsid w:val="6BDE7E80"/>
     <w:multiLevelType w:val="hybridMultilevel"/>
     <w:tmpl w:val="A64AE8DC"/>
@@ -4840,7 +5241,7 @@
         <w:rFonts w:ascii="Symbol" w:hAnsi="Symbol" w:hint="default"/>
       </w:rPr>
     </w:lvl>
-    <w:lvl w:ilvl="1" w:tplc="04090003" w:tentative="1">
+    <w:lvl w:ilvl="1" w:tplc="04090003">
       <w:start w:val="1"/>
       <w:numFmt w:val="bullet"/>
       <w:lvlText w:val="o"/>
@@ -4937,7 +5338,7 @@
       </w:rPr>
     </w:lvl>
   </w:abstractNum>
-  <w:abstractNum w:abstractNumId="12" w15:restartNumberingAfterBreak="0">
+  <w:abstractNum w:abstractNumId="13" w15:restartNumberingAfterBreak="0">
     <w:nsid w:val="70B75BD5"/>
     <w:multiLevelType w:val="hybridMultilevel"/>
     <w:tmpl w:val="78D6311A"/>
@@ -5050,7 +5451,7 @@
       </w:rPr>
     </w:lvl>
   </w:abstractNum>
-  <w:abstractNum w:abstractNumId="13" w15:restartNumberingAfterBreak="0">
+  <w:abstractNum w:abstractNumId="14" w15:restartNumberingAfterBreak="0">
     <w:nsid w:val="720F7DF1"/>
     <w:multiLevelType w:val="hybridMultilevel"/>
     <w:tmpl w:val="ABBE379C"/>
@@ -5163,7 +5564,7 @@
       </w:rPr>
     </w:lvl>
   </w:abstractNum>
-  <w:abstractNum w:abstractNumId="14" w15:restartNumberingAfterBreak="0">
+  <w:abstractNum w:abstractNumId="15" w15:restartNumberingAfterBreak="0">
     <w:nsid w:val="7AA137E5"/>
     <w:multiLevelType w:val="hybridMultilevel"/>
     <w:tmpl w:val="37D8B310"/>
@@ -5277,49 +5678,52 @@
     </w:lvl>
   </w:abstractNum>
   <w:num w:numId="1" w16cid:durableId="1321738990">
+    <w:abstractNumId w:val="7"/>
+  </w:num>
+  <w:num w:numId="2" w16cid:durableId="1720979696">
+    <w:abstractNumId w:val="2"/>
+  </w:num>
+  <w:num w:numId="3" w16cid:durableId="2036540545">
+    <w:abstractNumId w:val="3"/>
+  </w:num>
+  <w:num w:numId="4" w16cid:durableId="1408839991">
+    <w:abstractNumId w:val="10"/>
+  </w:num>
+  <w:num w:numId="5" w16cid:durableId="842472488">
+    <w:abstractNumId w:val="12"/>
+  </w:num>
+  <w:num w:numId="6" w16cid:durableId="1526139151">
     <w:abstractNumId w:val="6"/>
   </w:num>
-  <w:num w:numId="2" w16cid:durableId="1720979696">
+  <w:num w:numId="7" w16cid:durableId="2111661888">
+    <w:abstractNumId w:val="9"/>
+  </w:num>
+  <w:num w:numId="8" w16cid:durableId="1503083166">
+    <w:abstractNumId w:val="14"/>
+  </w:num>
+  <w:num w:numId="9" w16cid:durableId="332342232">
+    <w:abstractNumId w:val="4"/>
+  </w:num>
+  <w:num w:numId="10" w16cid:durableId="1691486847">
+    <w:abstractNumId w:val="11"/>
+  </w:num>
+  <w:num w:numId="11" w16cid:durableId="1264802431">
+    <w:abstractNumId w:val="15"/>
+  </w:num>
+  <w:num w:numId="12" w16cid:durableId="392894016">
+    <w:abstractNumId w:val="8"/>
+  </w:num>
+  <w:num w:numId="13" w16cid:durableId="719548311">
+    <w:abstractNumId w:val="5"/>
+  </w:num>
+  <w:num w:numId="14" w16cid:durableId="2082019339">
     <w:abstractNumId w:val="1"/>
   </w:num>
-  <w:num w:numId="3" w16cid:durableId="2036540545">
-    <w:abstractNumId w:val="2"/>
-  </w:num>
-  <w:num w:numId="4" w16cid:durableId="1408839991">
-    <w:abstractNumId w:val="9"/>
-  </w:num>
-  <w:num w:numId="5" w16cid:durableId="842472488">
-    <w:abstractNumId w:val="11"/>
-  </w:num>
-  <w:num w:numId="6" w16cid:durableId="1526139151">
-    <w:abstractNumId w:val="5"/>
-  </w:num>
-  <w:num w:numId="7" w16cid:durableId="2111661888">
-    <w:abstractNumId w:val="8"/>
-  </w:num>
-  <w:num w:numId="8" w16cid:durableId="1503083166">
+  <w:num w:numId="15" w16cid:durableId="212348346">
     <w:abstractNumId w:val="13"/>
   </w:num>
-  <w:num w:numId="9" w16cid:durableId="332342232">
-    <w:abstractNumId w:val="3"/>
-  </w:num>
-  <w:num w:numId="10" w16cid:durableId="1691486847">
-    <w:abstractNumId w:val="10"/>
-  </w:num>
-  <w:num w:numId="11" w16cid:durableId="1264802431">
-    <w:abstractNumId w:val="14"/>
-  </w:num>
-  <w:num w:numId="12" w16cid:durableId="392894016">
-    <w:abstractNumId w:val="7"/>
-  </w:num>
-  <w:num w:numId="13" w16cid:durableId="719548311">
-    <w:abstractNumId w:val="4"/>
-  </w:num>
-  <w:num w:numId="14" w16cid:durableId="2082019339">
+  <w:num w:numId="16" w16cid:durableId="832183978">
     <w:abstractNumId w:val="0"/>
-  </w:num>
-  <w:num w:numId="15" w16cid:durableId="212348346">
-    <w:abstractNumId w:val="12"/>
   </w:num>
   <w:numIdMacAtCleanup w:val="9"/>
 </w:numbering>

</xml_diff>